<commit_message>
update nội dung file A1
</commit_message>
<xml_diff>
--- a/A/A1.docx
+++ b/A/A1.docx
@@ -12,6 +12,31 @@
     </w:p>
     <w:p>
       <w:pPr>
+        <w:pStyle w:val="Heading2"/>
+      </w:pPr>
+      <w:r>
+        <w:t>A1.1</w:t>
+      </w:r>
+    </w:p>
+    <w:p>
+      <w:pPr>
+        <w:pStyle w:val="Heading3"/>
+      </w:pPr>
+      <w:r>
+        <w:t>A1.1.1</w:t>
+      </w:r>
+    </w:p>
+    <w:p>
+      <w:pPr>
+        <w:pStyle w:val="Heading2"/>
+      </w:pPr>
+      <w:r>
+        <w:t>A1.2</w:t>
+      </w:r>
+    </w:p>
+    <w:p/>
+    <w:p>
+      <w:pPr>
         <w:pStyle w:val="Heading1"/>
       </w:pPr>
       <w:r>
@@ -20,10 +45,42 @@
     </w:p>
     <w:p>
       <w:pPr>
+        <w:pStyle w:val="Heading2"/>
+      </w:pPr>
+      <w:r>
+        <w:t>A2.1</w:t>
+      </w:r>
+    </w:p>
+    <w:p>
+      <w:pPr>
+        <w:pStyle w:val="Heading2"/>
+      </w:pPr>
+      <w:r>
+        <w:t>A2.2</w:t>
+      </w:r>
+    </w:p>
+    <w:p>
+      <w:pPr>
         <w:pStyle w:val="Heading1"/>
       </w:pPr>
       <w:r>
         <w:t>A3</w:t>
+      </w:r>
+    </w:p>
+    <w:p>
+      <w:pPr>
+        <w:pStyle w:val="Heading2"/>
+      </w:pPr>
+      <w:r>
+        <w:t>A3.1</w:t>
+      </w:r>
+    </w:p>
+    <w:p>
+      <w:pPr>
+        <w:pStyle w:val="Heading2"/>
+      </w:pPr>
+      <w:r>
+        <w:t>A3.2</w:t>
       </w:r>
     </w:p>
     <w:sectPr>
@@ -464,7 +521,6 @@
     <w:next w:val="Normal"/>
     <w:link w:val="Heading2Char"/>
     <w:uiPriority w:val="9"/>
-    <w:semiHidden/>
     <w:unhideWhenUsed/>
     <w:qFormat/>
     <w:rsid w:val="00654813"/>
@@ -487,7 +543,6 @@
     <w:next w:val="Normal"/>
     <w:link w:val="Heading3Char"/>
     <w:uiPriority w:val="9"/>
-    <w:semiHidden/>
     <w:unhideWhenUsed/>
     <w:qFormat/>
     <w:rsid w:val="00654813"/>
@@ -681,7 +736,6 @@
     <w:basedOn w:val="DefaultParagraphFont"/>
     <w:link w:val="Heading2"/>
     <w:uiPriority w:val="9"/>
-    <w:semiHidden/>
     <w:rsid w:val="00654813"/>
     <w:rPr>
       <w:rFonts w:asciiTheme="majorHAnsi" w:eastAsiaTheme="majorEastAsia" w:hAnsiTheme="majorHAnsi" w:cstheme="majorBidi"/>
@@ -695,7 +749,6 @@
     <w:basedOn w:val="DefaultParagraphFont"/>
     <w:link w:val="Heading3"/>
     <w:uiPriority w:val="9"/>
-    <w:semiHidden/>
     <w:rsid w:val="00654813"/>
     <w:rPr>
       <w:rFonts w:eastAsiaTheme="majorEastAsia" w:cstheme="majorBidi"/>

</xml_diff>